<commit_message>
Cover letter: remove redundant companion-disclosure note (already cited in the manuscript)
</commit_message>
<xml_diff>
--- a/three-generations-healthcare-it_COVER_LETTER.docx
+++ b/three-generations-healthcare-it_COVER_LETTER.docx
@@ -304,15 +304,7 @@
           <w:b w:val="0"/>
           <w:i w:val="0"/>
         </w:rPr>
-        <w:t xml:space="preserve">We are equally explicit about evidence. The manuscript is a framework and a vocabulary; a companion feasibility study is summarized as a controlled feasibility demonstration for one narrow task (follow-up-instruction extraction), not as validation of the framework itself, and clinical utility and safety are stated as prospective hypotheses with human confirmation as the expected operating mode. </w:t>
-      </w:r>
-      <w:r>
-        <w:rPr>
-          <w:b w:val="0"/>
-          <w:i w:val="0"/>
-          <w:color w:val="CC0000"/>
-        </w:rPr>
-        <w:t>For transparency, the companion feasibility study cited here is currently available as a preprint (Laufer M, Aperstein Y, Apartsin A. Reliable Extraction of Clinical Follow-Up Instructions: A Hybrid Neural-Symbolic Pipeline. arXiv:2605.26560).</w:t>
+        <w:t>We are equally explicit about evidence. The manuscript is a framework and a vocabulary; a companion feasibility study is summarized as a controlled feasibility demonstration for one narrow task (follow-up-instruction extraction), not as validation of the framework itself, and clinical utility and safety are stated as prospective hypotheses with human confirmation as the expected operating mode.</w:t>
       </w:r>
     </w:p>
     <w:p>

</xml_diff>